<commit_message>
update readme, add more EDA diagrams
</commit_message>
<xml_diff>
--- a/slides_notes/EDA.docx
+++ b/slides_notes/EDA.docx
@@ -619,7 +619,7 @@
         <w:rPr>
           <w:rtl w:val="0"/>
         </w:rPr>
-        <w:t xml:space="preserve">Exploratory Data Analysis was conducted to better understand the patterns and distributions within the selected variables before model building. The analysis included examining the distribution of the target variable, customer age, account balance, job categories, and previous campaign outcomes. Visualizations such as bar charts and histograms were used to identify class imbalance, common customer characteristics, and possible relationships between selected features and subscription outcomes. This step was important because it helped reveal trends in the data and provided a better understanding of which variables may influence customer behavior.</w:t>
+        <w:t xml:space="preserve">Exploratory Data Analysis was conducted to better understand the patterns, distributions, and relationships within the selected variables before model building. The analysis included examining the distribution of the target variable, customer age, account balance, job categories, and previous campaign outcomes. Visualizations such as bar charts, histograms, a correlation heatmap, and a boxplot were used to identify class imbalance, common customer characteristics, correlations among selected variables, and possible outliers. The correlation heatmap helped show the strength and direction of relationships between numeric and encoded variables, while the boxplot of account balance was used to detect extreme values. This step was important because it revealed trends in the data and provided a clearer understanding of which variables may influence customer behavior and subscription outcomes. </w:t>
       </w:r>
     </w:p>
     <w:p>
@@ -657,7 +657,35 @@
         <w:rPr>
           <w:rtl w:val="0"/>
         </w:rPr>
-        <w:t xml:space="preserve">The exploratory analysis showed that the number of customers who did not subscribe to a term deposit was much higher than the number who did subscribe, indicating class imbalance in the dataset. The age distribution suggested that most customers were within the adult and middle-aged range. The balance variable appeared unevenly distributed, with many lower values and a smaller number of very high balances, suggesting a right-skewed pattern. The job-based comparison indicated that subscription behavior may differ across occupational categories. In addition, the previous campaign outcome appeared to be related to current subscription decisions, suggesting that past marketing interactions may influence future responses.</w:t>
+        <w:t xml:space="preserve">The exploratory analysis showed that the number of customers who did not subscribe to a term deposit was much higher than the number who did subscribe, indicating class imbalance in the dataset. The age distribution suggested that most customers were within the adult and middle-aged range. The balance variable appeared unevenly distributed, with many lower values and a smaller number of very high balances, suggesting a right-skewed pattern. The boxplot of account balance confirmed the presence of multiple outliers, especially on the high end, as well as a few negative-balance outliers. The job-based comparison indicated that subscription behavior may differ across occupational categories. In addition, the previous campaign outcome appeared to be related to current subscription decisions, suggesting that past marketing interactions may influence future responses. The correlation heatmap showed that most variables had weak correlations with each other, indicating low multicollinearity, while </w:t>
+      </w:r>
+      <w:r>
+        <w:rPr>
+          <w:b w:val="1"/>
+          <w:bCs w:val="1"/>
+          <w:rtl w:val="0"/>
+        </w:rPr>
+        <w:t xml:space="preserve">duration</w:t>
+      </w:r>
+      <w:r>
+        <w:rPr>
+          <w:rtl w:val="0"/>
+        </w:rPr>
+        <w:t xml:space="preserve"> had the strongest positive relationship with the target variable </w:t>
+      </w:r>
+      <w:r>
+        <w:rPr>
+          <w:rFonts w:ascii="Roboto Mono" w:cs="Roboto Mono" w:eastAsia="Roboto Mono" w:hAnsi="Roboto Mono"/>
+          <w:color w:val="188038"/>
+          <w:rtl w:val="0"/>
+        </w:rPr>
+        <w:t xml:space="preserve">y</w:t>
+      </w:r>
+      <w:r>
+        <w:rPr>
+          <w:rtl w:val="0"/>
+        </w:rPr>
+        <w:t xml:space="preserve">, suggesting that longer calls were associated with a higher chance of subscription. Overall, these EDA results provided useful insights into the dataset and helped support the later modeling stage. </w:t>
       </w:r>
     </w:p>
     <w:p>
@@ -843,12 +871,12 @@
           <wp:inline distB="114300" distT="114300" distL="114300" distR="114300">
             <wp:extent cx="5943600" cy="4521200"/>
             <wp:effectExtent b="0" l="0" r="0" t="0"/>
-            <wp:docPr id="2" name="image5.png"/>
+            <wp:docPr id="3" name="image7.png"/>
             <a:graphic>
               <a:graphicData uri="http://schemas.openxmlformats.org/drawingml/2006/picture">
                 <pic:pic>
                   <pic:nvPicPr>
-                    <pic:cNvPr id="0" name="image5.png"/>
+                    <pic:cNvPr id="0" name="image7.png"/>
                     <pic:cNvPicPr preferRelativeResize="0"/>
                   </pic:nvPicPr>
                   <pic:blipFill>
@@ -909,12 +937,12 @@
           <wp:inline distB="114300" distT="114300" distL="114300" distR="114300">
             <wp:extent cx="5943600" cy="4648200"/>
             <wp:effectExtent b="0" l="0" r="0" t="0"/>
-            <wp:docPr id="4" name="image2.png"/>
+            <wp:docPr id="6" name="image4.png"/>
             <a:graphic>
               <a:graphicData uri="http://schemas.openxmlformats.org/drawingml/2006/picture">
                 <pic:pic>
                   <pic:nvPicPr>
-                    <pic:cNvPr id="0" name="image2.png"/>
+                    <pic:cNvPr id="0" name="image4.png"/>
                     <pic:cNvPicPr preferRelativeResize="0"/>
                   </pic:nvPicPr>
                   <pic:blipFill>
@@ -985,12 +1013,12 @@
           <wp:inline distB="114300" distT="114300" distL="114300" distR="114300">
             <wp:extent cx="5943600" cy="4572000"/>
             <wp:effectExtent b="0" l="0" r="0" t="0"/>
-            <wp:docPr id="1" name="image3.png"/>
+            <wp:docPr id="2" name="image6.png"/>
             <a:graphic>
               <a:graphicData uri="http://schemas.openxmlformats.org/drawingml/2006/picture">
                 <pic:pic>
                   <pic:nvPicPr>
-                    <pic:cNvPr id="0" name="image3.png"/>
+                    <pic:cNvPr id="0" name="image6.png"/>
                     <pic:cNvPicPr preferRelativeResize="0"/>
                   </pic:nvPicPr>
                   <pic:blipFill>
@@ -1061,7 +1089,7 @@
           <wp:inline distB="114300" distT="114300" distL="114300" distR="114300">
             <wp:extent cx="5943600" cy="3822700"/>
             <wp:effectExtent b="0" l="0" r="0" t="0"/>
-            <wp:docPr id="5" name="image1.png"/>
+            <wp:docPr id="7" name="image1.png"/>
             <a:graphic>
               <a:graphicData uri="http://schemas.openxmlformats.org/drawingml/2006/picture">
                 <pic:pic>
@@ -1127,12 +1155,12 @@
           <wp:inline distB="114300" distT="114300" distL="114300" distR="114300">
             <wp:extent cx="5943600" cy="5067300"/>
             <wp:effectExtent b="0" l="0" r="0" t="0"/>
-            <wp:docPr id="3" name="image4.png"/>
+            <wp:docPr id="5" name="image5.png"/>
             <a:graphic>
               <a:graphicData uri="http://schemas.openxmlformats.org/drawingml/2006/picture">
                 <pic:pic>
                   <pic:nvPicPr>
-                    <pic:cNvPr id="0" name="image4.png"/>
+                    <pic:cNvPr id="0" name="image5.png"/>
                     <pic:cNvPicPr preferRelativeResize="0"/>
                   </pic:nvPicPr>
                   <pic:blipFill>
@@ -1146,6 +1174,108 @@
                     <a:xfrm>
                       <a:off x="0" y="0"/>
                       <a:ext cx="5943600" cy="5067300"/>
+                    </a:xfrm>
+                    <a:prstGeom prst="rect"/>
+                    <a:ln/>
+                  </pic:spPr>
+                </pic:pic>
+              </a:graphicData>
+            </a:graphic>
+          </wp:inline>
+        </w:drawing>
+      </w:r>
+      <w:r>
+        <w:rPr>
+          <w:rtl w:val="0"/>
+        </w:rPr>
+      </w:r>
+    </w:p>
+    <w:p>
+      <w:pPr>
+        <w:rPr/>
+      </w:pPr>
+      <w:r>
+        <w:rPr>
+          <w:rtl w:val="0"/>
+        </w:rPr>
+        <w:t xml:space="preserve">Figure 6. Correlation Heatmap of Selected Variables </w:t>
+      </w:r>
+      <w:r>
+        <w:rPr/>
+        <w:drawing>
+          <wp:inline distB="114300" distT="114300" distL="114300" distR="114300">
+            <wp:extent cx="5943600" cy="5245100"/>
+            <wp:effectExtent b="0" l="0" r="0" t="0"/>
+            <wp:docPr id="4" name="image2.png"/>
+            <a:graphic>
+              <a:graphicData uri="http://schemas.openxmlformats.org/drawingml/2006/picture">
+                <pic:pic>
+                  <pic:nvPicPr>
+                    <pic:cNvPr id="0" name="image2.png"/>
+                    <pic:cNvPicPr preferRelativeResize="0"/>
+                  </pic:nvPicPr>
+                  <pic:blipFill>
+                    <a:blip r:embed="rId11"/>
+                    <a:srcRect b="0" l="0" r="0" t="0"/>
+                    <a:stretch>
+                      <a:fillRect/>
+                    </a:stretch>
+                  </pic:blipFill>
+                  <pic:spPr>
+                    <a:xfrm>
+                      <a:off x="0" y="0"/>
+                      <a:ext cx="5943600" cy="5245100"/>
+                    </a:xfrm>
+                    <a:prstGeom prst="rect"/>
+                    <a:ln/>
+                  </pic:spPr>
+                </pic:pic>
+              </a:graphicData>
+            </a:graphic>
+          </wp:inline>
+        </w:drawing>
+      </w:r>
+      <w:r>
+        <w:rPr>
+          <w:rtl w:val="0"/>
+        </w:rPr>
+      </w:r>
+    </w:p>
+    <w:p>
+      <w:pPr>
+        <w:rPr/>
+      </w:pPr>
+      <w:r>
+        <w:rPr>
+          <w:rtl w:val="0"/>
+        </w:rPr>
+        <w:t xml:space="preserve">Figure 7. Boxplot of Account Balance Showing Outliers </w:t>
+      </w:r>
+      <w:r>
+        <w:rPr/>
+        <w:drawing>
+          <wp:inline distB="114300" distT="114300" distL="114300" distR="114300">
+            <wp:extent cx="5943600" cy="3721100"/>
+            <wp:effectExtent b="0" l="0" r="0" t="0"/>
+            <wp:docPr id="1" name="image3.png"/>
+            <a:graphic>
+              <a:graphicData uri="http://schemas.openxmlformats.org/drawingml/2006/picture">
+                <pic:pic>
+                  <pic:nvPicPr>
+                    <pic:cNvPr id="0" name="image3.png"/>
+                    <pic:cNvPicPr preferRelativeResize="0"/>
+                  </pic:nvPicPr>
+                  <pic:blipFill>
+                    <a:blip r:embed="rId12"/>
+                    <a:srcRect b="0" l="0" r="0" t="0"/>
+                    <a:stretch>
+                      <a:fillRect/>
+                    </a:stretch>
+                  </pic:blipFill>
+                  <pic:spPr>
+                    <a:xfrm>
+                      <a:off x="0" y="0"/>
+                      <a:ext cx="5943600" cy="3721100"/>
                     </a:xfrm>
                     <a:prstGeom prst="rect"/>
                     <a:ln/>

</xml_diff>